<commit_message>
LF3/LF9: Streudiagramme auf schlichte Measures (klare Achsenbeschriftung)
Die Kreis-Streudiagramme nutzten die (Geschlecht)-Measures ohne
Geschlechtsfilter - Werte korrekt (identisch zur Insgesamt-Quote,
max. 0,005 pp), aber die Achse beschriftete sich irrefuehrend als
"... (Geschlecht) %".

- LF3-Scatter: Quote ohne HSA (Geschlecht) % -> Quote ohne HSA %,
  Abiturquote (Geschlecht) % -> Abiturquote %.
- LF9-Scatter: Quote ohne HSA (Geschlecht) % -> Quote ohne HSA %.
- LF4 bleibt unveraendert (Geschlecht-Measures dort korrekt).
- .pbix neu exportiert, LF3/LF9-Bilder neu, DOCX/PPTX neu gebaut.
- verify_all 93/93 gruen.

Co-Authored-By: Claude Opus 4.8 <noreply@anthropic.com>
</commit_message>
<xml_diff>
--- a/Schulabschluss_DataStory_Dokumentation.docx
+++ b/Schulabschluss_DataStory_Dokumentation.docx
@@ -2980,7 +2980,7 @@
       <w:r>
         <w:drawing>
           <wp:inline xmlns:a="http://schemas.openxmlformats.org/drawingml/2006/main" xmlns:pic="http://schemas.openxmlformats.org/drawingml/2006/picture">
-            <wp:extent cx="5760720" cy="3666671"/>
+            <wp:extent cx="5760720" cy="3671499"/>
             <wp:docPr id="4" name="Picture 4"/>
             <wp:cNvGraphicFramePr>
               <a:graphicFrameLocks noChangeAspect="1"/>
@@ -3001,7 +3001,7 @@
                   <pic:spPr>
                     <a:xfrm>
                       <a:off x="0" y="0"/>
-                      <a:ext cx="5760720" cy="3666671"/>
+                      <a:ext cx="5760720" cy="3671499"/>
                     </a:xfrm>
                     <a:prstGeom prst="rect"/>
                   </pic:spPr>
@@ -3674,7 +3674,7 @@
       <w:r>
         <w:drawing>
           <wp:inline xmlns:a="http://schemas.openxmlformats.org/drawingml/2006/main" xmlns:pic="http://schemas.openxmlformats.org/drawingml/2006/picture">
-            <wp:extent cx="5760720" cy="3076389"/>
+            <wp:extent cx="5760720" cy="3076224"/>
             <wp:docPr id="10" name="Picture 10"/>
             <wp:cNvGraphicFramePr>
               <a:graphicFrameLocks noChangeAspect="1"/>
@@ -3695,7 +3695,7 @@
                   <pic:spPr>
                     <a:xfrm>
                       <a:off x="0" y="0"/>
-                      <a:ext cx="5760720" cy="3076389"/>
+                      <a:ext cx="5760720" cy="3076224"/>
                     </a:xfrm>
                     <a:prstGeom prst="rect"/>
                   </pic:spPr>

</xml_diff>

<commit_message>
Deliverables neu aus korrigiertem Bericht: Bild-Regeneration + DOCX/PPTX/PDF
Alle 9 Berichtsseiten frisch aus Power BI als PDF exportiert und zu
charts/pbi/pbi_lf*.png geschnitten (Auto-Bounding-Box, "Power BI Desktop"-
Export-Header sauber entfernt). Damit spiegeln die eingebetteten Bilder den
korrigierten Bericht wider – u.a.:
- LF6 relativ zeigt jetzt die richtige Achse (~41,6 je 1.000 statt Faktor-2 ~78),
  Chart und Text stimmen überein.
- LF1 zeigt die Sachsen-Anhalt-Hervorhebung (vermillion).
- LF4-KPIs und die jahr=2023-gepinnten Visuals auf Ist-Stand.

DOCX (p7) und PPTX (p6, 14 Folien/Notizen) neu gebaut; Präsentations-PDF aus
der neuen PPTX regeneriert; powerbi/SchulabschlussDataStory_bericht.pdf auf den
frischen Export aktualisiert. verify_all 93/93 grün.

Co-Authored-By: Claude Opus 4.8 <noreply@anthropic.com>
</commit_message>
<xml_diff>
--- a/Schulabschluss_DataStory_Dokumentation.docx
+++ b/Schulabschluss_DataStory_Dokumentation.docx
@@ -2766,7 +2766,7 @@
       <w:r>
         <w:drawing>
           <wp:inline xmlns:a="http://schemas.openxmlformats.org/drawingml/2006/main" xmlns:pic="http://schemas.openxmlformats.org/drawingml/2006/picture">
-            <wp:extent cx="5760720" cy="2469727"/>
+            <wp:extent cx="5760720" cy="3199120"/>
             <wp:docPr id="2" name="Picture 2"/>
             <wp:cNvGraphicFramePr>
               <a:graphicFrameLocks noChangeAspect="1"/>
@@ -2787,7 +2787,7 @@
                   <pic:spPr>
                     <a:xfrm>
                       <a:off x="0" y="0"/>
-                      <a:ext cx="5760720" cy="2469727"/>
+                      <a:ext cx="5760720" cy="3199120"/>
                     </a:xfrm>
                     <a:prstGeom prst="rect"/>
                   </pic:spPr>
@@ -2873,7 +2873,7 @@
       <w:r>
         <w:drawing>
           <wp:inline xmlns:a="http://schemas.openxmlformats.org/drawingml/2006/main" xmlns:pic="http://schemas.openxmlformats.org/drawingml/2006/picture">
-            <wp:extent cx="5760720" cy="3131358"/>
+            <wp:extent cx="5760720" cy="3237525"/>
             <wp:docPr id="3" name="Picture 3"/>
             <wp:cNvGraphicFramePr>
               <a:graphicFrameLocks noChangeAspect="1"/>
@@ -2894,7 +2894,7 @@
                   <pic:spPr>
                     <a:xfrm>
                       <a:off x="0" y="0"/>
-                      <a:ext cx="5760720" cy="3131358"/>
+                      <a:ext cx="5760720" cy="3237525"/>
                     </a:xfrm>
                     <a:prstGeom prst="rect"/>
                   </pic:spPr>
@@ -2980,7 +2980,7 @@
       <w:r>
         <w:drawing>
           <wp:inline xmlns:a="http://schemas.openxmlformats.org/drawingml/2006/main" xmlns:pic="http://schemas.openxmlformats.org/drawingml/2006/picture">
-            <wp:extent cx="5760720" cy="3671499"/>
+            <wp:extent cx="5760720" cy="3802075"/>
             <wp:docPr id="4" name="Picture 4"/>
             <wp:cNvGraphicFramePr>
               <a:graphicFrameLocks noChangeAspect="1"/>
@@ -3001,7 +3001,7 @@
                   <pic:spPr>
                     <a:xfrm>
                       <a:off x="0" y="0"/>
-                      <a:ext cx="5760720" cy="3671499"/>
+                      <a:ext cx="5760720" cy="3802075"/>
                     </a:xfrm>
                     <a:prstGeom prst="rect"/>
                   </pic:spPr>
@@ -3098,7 +3098,7 @@
       <w:r>
         <w:drawing>
           <wp:inline xmlns:a="http://schemas.openxmlformats.org/drawingml/2006/main" xmlns:pic="http://schemas.openxmlformats.org/drawingml/2006/picture">
-            <wp:extent cx="5760720" cy="3730051"/>
+            <wp:extent cx="5760720" cy="3237525"/>
             <wp:docPr id="5" name="Picture 5"/>
             <wp:cNvGraphicFramePr>
               <a:graphicFrameLocks noChangeAspect="1"/>
@@ -3119,7 +3119,7 @@
                   <pic:spPr>
                     <a:xfrm>
                       <a:off x="0" y="0"/>
-                      <a:ext cx="5760720" cy="3730051"/>
+                      <a:ext cx="5760720" cy="3237525"/>
                     </a:xfrm>
                     <a:prstGeom prst="rect"/>
                   </pic:spPr>
@@ -3220,7 +3220,7 @@
       <w:r>
         <w:drawing>
           <wp:inline xmlns:a="http://schemas.openxmlformats.org/drawingml/2006/main" xmlns:pic="http://schemas.openxmlformats.org/drawingml/2006/picture">
-            <wp:extent cx="5760720" cy="2600693"/>
+            <wp:extent cx="5760720" cy="3237525"/>
             <wp:docPr id="6" name="Picture 6"/>
             <wp:cNvGraphicFramePr>
               <a:graphicFrameLocks noChangeAspect="1"/>
@@ -3241,7 +3241,7 @@
                   <pic:spPr>
                     <a:xfrm>
                       <a:off x="0" y="0"/>
-                      <a:ext cx="5760720" cy="2600693"/>
+                      <a:ext cx="5760720" cy="3237525"/>
                     </a:xfrm>
                     <a:prstGeom prst="rect"/>
                   </pic:spPr>
@@ -3327,7 +3327,7 @@
       <w:r>
         <w:drawing>
           <wp:inline xmlns:a="http://schemas.openxmlformats.org/drawingml/2006/main" xmlns:pic="http://schemas.openxmlformats.org/drawingml/2006/picture">
-            <wp:extent cx="5760720" cy="2204436"/>
+            <wp:extent cx="5760720" cy="3252887"/>
             <wp:docPr id="7" name="Picture 7"/>
             <wp:cNvGraphicFramePr>
               <a:graphicFrameLocks noChangeAspect="1"/>
@@ -3348,7 +3348,7 @@
                   <pic:spPr>
                     <a:xfrm>
                       <a:off x="0" y="0"/>
-                      <a:ext cx="5760720" cy="2204436"/>
+                      <a:ext cx="5760720" cy="3252887"/>
                     </a:xfrm>
                     <a:prstGeom prst="rect"/>
                   </pic:spPr>
@@ -3445,7 +3445,7 @@
       <w:r>
         <w:drawing>
           <wp:inline xmlns:a="http://schemas.openxmlformats.org/drawingml/2006/main" xmlns:pic="http://schemas.openxmlformats.org/drawingml/2006/picture">
-            <wp:extent cx="5760720" cy="3723596"/>
+            <wp:extent cx="5760720" cy="3456432"/>
             <wp:docPr id="8" name="Picture 8"/>
             <wp:cNvGraphicFramePr>
               <a:graphicFrameLocks noChangeAspect="1"/>
@@ -3466,7 +3466,7 @@
                   <pic:spPr>
                     <a:xfrm>
                       <a:off x="0" y="0"/>
-                      <a:ext cx="5760720" cy="3723596"/>
+                      <a:ext cx="5760720" cy="3456432"/>
                     </a:xfrm>
                     <a:prstGeom prst="rect"/>
                   </pic:spPr>
@@ -3552,7 +3552,7 @@
       <w:r>
         <w:drawing>
           <wp:inline xmlns:a="http://schemas.openxmlformats.org/drawingml/2006/main" xmlns:pic="http://schemas.openxmlformats.org/drawingml/2006/picture">
-            <wp:extent cx="5760720" cy="2943908"/>
+            <wp:extent cx="5760720" cy="3410346"/>
             <wp:docPr id="9" name="Picture 9"/>
             <wp:cNvGraphicFramePr>
               <a:graphicFrameLocks noChangeAspect="1"/>
@@ -3573,7 +3573,7 @@
                   <pic:spPr>
                     <a:xfrm>
                       <a:off x="0" y="0"/>
-                      <a:ext cx="5760720" cy="2943908"/>
+                      <a:ext cx="5760720" cy="3410346"/>
                     </a:xfrm>
                     <a:prstGeom prst="rect"/>
                   </pic:spPr>
@@ -3674,7 +3674,7 @@
       <w:r>
         <w:drawing>
           <wp:inline xmlns:a="http://schemas.openxmlformats.org/drawingml/2006/main" xmlns:pic="http://schemas.openxmlformats.org/drawingml/2006/picture">
-            <wp:extent cx="5760720" cy="3076224"/>
+            <wp:extent cx="5760720" cy="3237525"/>
             <wp:docPr id="10" name="Picture 10"/>
             <wp:cNvGraphicFramePr>
               <a:graphicFrameLocks noChangeAspect="1"/>
@@ -3695,7 +3695,7 @@
                   <pic:spPr>
                     <a:xfrm>
                       <a:off x="0" y="0"/>
-                      <a:ext cx="5760720" cy="3076224"/>
+                      <a:ext cx="5760720" cy="3237525"/>
                     </a:xfrm>
                     <a:prstGeom prst="rect"/>
                   </pic:spPr>

</xml_diff>

<commit_message>
Runde 3 – Deliverables + Doku: Bilder/DOCX/PPTX/PDF neu, Entscheidungsprotokoll
- Alle 9 LF-Seiten frisch exportiert und gecroppt (10-Seiten-PDF, Intro
  übersprungen); DOCX, PPTX (14 Folien/Notizen) und Präsentations-PDF neu.
- REVIEW_BEFUND.md: Runde-3-Entscheidungsprotokoll (LF9 Top-10 statt Gradient,
  Scatter bleibt, LF1-Linie behalten, LF2-Karte behalten + Werkzeug-Grenze,
  Slicer-Sync bewusst nicht, Drillthrough verschoben).
- BEFUNDE_UND_KORREKTUREN.md: Werkzeug-Grenze "kein natives Kreis-Choropleth"
  (Shape Map braucht TopoJSON, Filled Map geocodiert nur Namen/Doppelnamen).

Co-Authored-By: Claude Opus 4.8 <noreply@anthropic.com>
</commit_message>
<xml_diff>
--- a/Schulabschluss_DataStory_Dokumentation.docx
+++ b/Schulabschluss_DataStory_Dokumentation.docx
@@ -2766,7 +2766,7 @@
       <w:r>
         <w:drawing>
           <wp:inline xmlns:a="http://schemas.openxmlformats.org/drawingml/2006/main" xmlns:pic="http://schemas.openxmlformats.org/drawingml/2006/picture">
-            <wp:extent cx="5760720" cy="3798235"/>
+            <wp:extent cx="5760720" cy="3752149"/>
             <wp:docPr id="2" name="Picture 2"/>
             <wp:cNvGraphicFramePr>
               <a:graphicFrameLocks noChangeAspect="1"/>
@@ -2787,7 +2787,7 @@
                   <pic:spPr>
                     <a:xfrm>
                       <a:off x="0" y="0"/>
-                      <a:ext cx="5760720" cy="3798235"/>
+                      <a:ext cx="5760720" cy="3752149"/>
                     </a:xfrm>
                     <a:prstGeom prst="rect"/>
                   </pic:spPr>
@@ -2873,7 +2873,7 @@
       <w:r>
         <w:drawing>
           <wp:inline xmlns:a="http://schemas.openxmlformats.org/drawingml/2006/main" xmlns:pic="http://schemas.openxmlformats.org/drawingml/2006/picture">
-            <wp:extent cx="5760720" cy="3260568"/>
+            <wp:extent cx="5760720" cy="3291291"/>
             <wp:docPr id="3" name="Picture 3"/>
             <wp:cNvGraphicFramePr>
               <a:graphicFrameLocks noChangeAspect="1"/>
@@ -2894,7 +2894,7 @@
                   <pic:spPr>
                     <a:xfrm>
                       <a:off x="0" y="0"/>
-                      <a:ext cx="5760720" cy="3260568"/>
+                      <a:ext cx="5760720" cy="3291291"/>
                     </a:xfrm>
                     <a:prstGeom prst="rect"/>
                   </pic:spPr>
@@ -2980,7 +2980,7 @@
       <w:r>
         <w:drawing>
           <wp:inline xmlns:a="http://schemas.openxmlformats.org/drawingml/2006/main" xmlns:pic="http://schemas.openxmlformats.org/drawingml/2006/picture">
-            <wp:extent cx="5760720" cy="3706063"/>
+            <wp:extent cx="5760720" cy="3752149"/>
             <wp:docPr id="4" name="Picture 4"/>
             <wp:cNvGraphicFramePr>
               <a:graphicFrameLocks noChangeAspect="1"/>
@@ -3001,7 +3001,7 @@
                   <pic:spPr>
                     <a:xfrm>
                       <a:off x="0" y="0"/>
-                      <a:ext cx="5760720" cy="3706063"/>
+                      <a:ext cx="5760720" cy="3752149"/>
                     </a:xfrm>
                     <a:prstGeom prst="rect"/>
                   </pic:spPr>
@@ -3098,7 +3098,7 @@
       <w:r>
         <w:drawing>
           <wp:inline xmlns:a="http://schemas.openxmlformats.org/drawingml/2006/main" xmlns:pic="http://schemas.openxmlformats.org/drawingml/2006/picture">
-            <wp:extent cx="5760720" cy="3237525"/>
+            <wp:extent cx="5760720" cy="3291291"/>
             <wp:docPr id="5" name="Picture 5"/>
             <wp:cNvGraphicFramePr>
               <a:graphicFrameLocks noChangeAspect="1"/>
@@ -3119,7 +3119,7 @@
                   <pic:spPr>
                     <a:xfrm>
                       <a:off x="0" y="0"/>
-                      <a:ext cx="5760720" cy="3237525"/>
+                      <a:ext cx="5760720" cy="3291291"/>
                     </a:xfrm>
                     <a:prstGeom prst="rect"/>
                   </pic:spPr>
@@ -3220,7 +3220,7 @@
       <w:r>
         <w:drawing>
           <wp:inline xmlns:a="http://schemas.openxmlformats.org/drawingml/2006/main" xmlns:pic="http://schemas.openxmlformats.org/drawingml/2006/picture">
-            <wp:extent cx="5760720" cy="3237525"/>
+            <wp:extent cx="5760720" cy="3291291"/>
             <wp:docPr id="6" name="Picture 6"/>
             <wp:cNvGraphicFramePr>
               <a:graphicFrameLocks noChangeAspect="1"/>
@@ -3241,7 +3241,7 @@
                   <pic:spPr>
                     <a:xfrm>
                       <a:off x="0" y="0"/>
-                      <a:ext cx="5760720" cy="3237525"/>
+                      <a:ext cx="5760720" cy="3291291"/>
                     </a:xfrm>
                     <a:prstGeom prst="rect"/>
                   </pic:spPr>
@@ -3327,7 +3327,7 @@
       <w:r>
         <w:drawing>
           <wp:inline xmlns:a="http://schemas.openxmlformats.org/drawingml/2006/main" xmlns:pic="http://schemas.openxmlformats.org/drawingml/2006/picture">
-            <wp:extent cx="5760720" cy="3275929"/>
+            <wp:extent cx="5760720" cy="3306653"/>
             <wp:docPr id="7" name="Picture 7"/>
             <wp:cNvGraphicFramePr>
               <a:graphicFrameLocks noChangeAspect="1"/>
@@ -3348,7 +3348,7 @@
                   <pic:spPr>
                     <a:xfrm>
                       <a:off x="0" y="0"/>
-                      <a:ext cx="5760720" cy="3275929"/>
+                      <a:ext cx="5760720" cy="3306653"/>
                     </a:xfrm>
                     <a:prstGeom prst="rect"/>
                   </pic:spPr>
@@ -3445,7 +3445,7 @@
       <w:r>
         <w:drawing>
           <wp:inline xmlns:a="http://schemas.openxmlformats.org/drawingml/2006/main" xmlns:pic="http://schemas.openxmlformats.org/drawingml/2006/picture">
-            <wp:extent cx="5760720" cy="3456432"/>
+            <wp:extent cx="5760720" cy="3575487"/>
             <wp:docPr id="8" name="Picture 8"/>
             <wp:cNvGraphicFramePr>
               <a:graphicFrameLocks noChangeAspect="1"/>
@@ -3466,7 +3466,7 @@
                   <pic:spPr>
                     <a:xfrm>
                       <a:off x="0" y="0"/>
-                      <a:ext cx="5760720" cy="3456432"/>
+                      <a:ext cx="5760720" cy="3575487"/>
                     </a:xfrm>
                     <a:prstGeom prst="rect"/>
                   </pic:spPr>
@@ -3552,7 +3552,7 @@
       <w:r>
         <w:drawing>
           <wp:inline xmlns:a="http://schemas.openxmlformats.org/drawingml/2006/main" xmlns:pic="http://schemas.openxmlformats.org/drawingml/2006/picture">
-            <wp:extent cx="4802833" cy="3931919"/>
+            <wp:extent cx="5760720" cy="3752149"/>
             <wp:docPr id="9" name="Picture 9"/>
             <wp:cNvGraphicFramePr>
               <a:graphicFrameLocks noChangeAspect="1"/>
@@ -3573,7 +3573,7 @@
                   <pic:spPr>
                     <a:xfrm>
                       <a:off x="0" y="0"/>
-                      <a:ext cx="4802833" cy="3931919"/>
+                      <a:ext cx="5760720" cy="3752149"/>
                     </a:xfrm>
                     <a:prstGeom prst="rect"/>
                   </pic:spPr>
@@ -3674,7 +3674,7 @@
       <w:r>
         <w:drawing>
           <wp:inline xmlns:a="http://schemas.openxmlformats.org/drawingml/2006/main" xmlns:pic="http://schemas.openxmlformats.org/drawingml/2006/picture">
-            <wp:extent cx="5760720" cy="3260568"/>
+            <wp:extent cx="5760720" cy="3291291"/>
             <wp:docPr id="10" name="Picture 10"/>
             <wp:cNvGraphicFramePr>
               <a:graphicFrameLocks noChangeAspect="1"/>
@@ -3695,7 +3695,7 @@
                   <pic:spPr>
                     <a:xfrm>
                       <a:off x="0" y="0"/>
-                      <a:ext cx="5760720" cy="3260568"/>
+                      <a:ext cx="5760720" cy="3291291"/>
                     </a:xfrm>
                     <a:prstGeom prst="rect"/>
                   </pic:spPr>

</xml_diff>

<commit_message>
LF3: StdAbw-Tabelle deutlich vergroessert; Namen-auf-Achse ehrlich getestet
- StdAbw-Tabelle auf der LF3-Seite stark vergroessert (x=704, 552x460, Schrift 14 pt) -
  die Streuungswerte je Bundesland sind jetzt prominent lesbar; pbi_lf3.png + DOCX/PPTX neu.
- Bundesland-NAMEN statt Positionsnummern auf der Dot-Plot-Achse: zweiten nativen Weg
  (Liniendiagramm, X=Land kategorial, Serie=Kreis, nur Marker) live getestet und VERWORFEN -
  Power BI reduziert bei ~400 Serien die Daten (i-Warnung, Punkte fehlen, Achse zerfaellt).
  SVG-Variante auf Teamwunsch nicht eingesetzt. Befund in BEFUNDE §8 dokumentiert;
  sauberer Namens-Weg bleibt Deneb (Anleitung + Specs liegen bereit).
- verify_all: 107/107 gruen; .pbip = .pbix.

Co-Authored-By: Claude Opus 4.8 <noreply@anthropic.com>
</commit_message>
<xml_diff>
--- a/Schulabschluss_DataStory_Dokumentation.docx
+++ b/Schulabschluss_DataStory_Dokumentation.docx
@@ -2980,7 +2980,7 @@
       <w:r>
         <w:drawing>
           <wp:inline xmlns:a="http://schemas.openxmlformats.org/drawingml/2006/main" xmlns:pic="http://schemas.openxmlformats.org/drawingml/2006/picture">
-            <wp:extent cx="5760720" cy="3759830"/>
+            <wp:extent cx="5760720" cy="3364260"/>
             <wp:docPr id="4" name="Picture 4"/>
             <wp:cNvGraphicFramePr>
               <a:graphicFrameLocks noChangeAspect="1"/>
@@ -3001,7 +3001,7 @@
                   <pic:spPr>
                     <a:xfrm>
                       <a:off x="0" y="0"/>
-                      <a:ext cx="5760720" cy="3759830"/>
+                      <a:ext cx="5760720" cy="3364260"/>
                     </a:xfrm>
                     <a:prstGeom prst="rect"/>
                   </pic:spPr>

</xml_diff>

<commit_message>
Runde 7: LF4 – "Gap" -> "Abweichung zwischen den Geschlechtern", KPI groesser + Bundesland-Filter
- 2 Delta-Karten: grosse Zahl (54pt), Kategorie-Label aus, Titel "Abweichung zwischen den Geschlechtern – ohne HSA/Abitur (pp)"
- Neuer Bundesland-Slicer (dim_region[Land], Einzelauswahl, Standard: Deutschland); Karten + Saeulen von ebene='DE' auf ebene IN (DE,BL) umgestellt -> Drilldown je Bundesland (alle 16 Laender datenseitig belegt, Gap 1,6-4,8 pp)
- Erkenntnis-Text + DOCX/PPTX-Captions + README + visual_spezifikation nachgezogen
- pbi_lf4.png neu gecroppt; .pbix + bericht.pdf neu exportiert
- verify_all 108/108 (neuer LF4-Regressionsguard)

Co-Authored-By: Claude Fable 5 <noreply@anthropic.com>
</commit_message>
<xml_diff>
--- a/Schulabschluss_DataStory_Dokumentation.docx
+++ b/Schulabschluss_DataStory_Dokumentation.docx
@@ -3098,7 +3098,7 @@
       <w:r>
         <w:drawing>
           <wp:inline xmlns:a="http://schemas.openxmlformats.org/drawingml/2006/main" xmlns:pic="http://schemas.openxmlformats.org/drawingml/2006/picture">
-            <wp:extent cx="5760720" cy="3763670"/>
+            <wp:extent cx="5760720" cy="3184788"/>
             <wp:docPr id="5" name="Picture 5"/>
             <wp:cNvGraphicFramePr>
               <a:graphicFrameLocks noChangeAspect="1"/>
@@ -3119,7 +3119,7 @@
                   <pic:spPr>
                     <a:xfrm>
                       <a:off x="0" y="0"/>
-                      <a:ext cx="5760720" cy="3763670"/>
+                      <a:ext cx="5760720" cy="3184788"/>
                     </a:xfrm>
                     <a:prstGeom prst="rect"/>
                   </pic:spPr>
@@ -3140,7 +3140,7 @@
           <w:color w:val="666666"/>
           <w:sz w:val="18"/>
         </w:rPr>
-        <w:t>Abb. 5 (LF4): Berichtsseite LF4 – Geschlechtergefälle ohne HSA und beim Abitur (DE 2023).</w:t>
+        <w:t>Abb. 5 (LF4): Berichtsseite LF4 – Abweichung zwischen den Geschlechtern (ohne HSA 2,6 pp, Abitur 7,8 pp) mit Bundesland-Filter (Standard: Deutschland).</w:t>
       </w:r>
     </w:p>
     <w:p>
@@ -3155,7 +3155,7 @@
         <w:rPr>
           <w:sz w:val="22"/>
         </w:rPr>
-        <w:t>Das Geschlecht wirkt an beiden Enden der Verteilung. Jungen sind am unteren Ende überrepräsentiert, Mädchen am oberen. Das ist ein struktureller, kein regionaler Effekt und tritt über alle Länder hinweg auf.</w:t>
+        <w:t>Das Geschlecht wirkt an beiden Enden der Verteilung. Jungen sind am unteren Ende überrepräsentiert, Mädchen am oberen. Das ist ein struktureller, kein regionaler Effekt und tritt über alle Länder hinweg auf. Über den Bundesland-Filter der Seite lässt sich das je Land nachvollziehen: die Abweichung ohne HSA reicht von 1,6 pp (Saarland) bis 4,8 pp (Sachsen-Anhalt), die Richtung bleibt überall gleich.</w:t>
       </w:r>
     </w:p>
     <w:p>

</xml_diff>

<commit_message>
Runde 8: LF5 – Bundesland-Filter wirkt nur auf das rechte Diagramm
- visualInteractions: Slicer 5c55 -> linkes Saeulendiagramm (Schuelerschaft, nur DE-Quelle) = NoFilter; rechtes Balkendiagramm (Abgaenge ohne HSA je Schulart) folgt weiter dem Land
- Live geprueft: Bayern -> rechts Bayern-Schularten (Foerderschulen 3,1 Tsd, Hauptschulen 2,7 Tsd, andere Rangfolge); links unveraendert bundesweit; Auswahl geloescht -> Default Deutschland
- DOCX- und README-Hinweis ergaenzt; .pbix neu exportiert
- verify_all 109/109 (neuer LF5-Regressionsguard: Slicer filtert nur rechts)

Co-Authored-By: Claude Fable 5 <noreply@anthropic.com>
</commit_message>
<xml_diff>
--- a/Schulabschluss_DataStory_Dokumentation.docx
+++ b/Schulabschluss_DataStory_Dokumentation.docx
@@ -3262,7 +3262,7 @@
           <w:color w:val="666666"/>
           <w:sz w:val="18"/>
         </w:rPr>
-        <w:t>Abb. 6 (LF5): Berichtsseite LF5 – links die Zusammensetzung der Schülerschaft nach Schulart (Input, DE 2023), rechts welche Schulart die Abgänge ohne Hauptschulabschluss stellt (Antwort, Destatis 21111-12).</w:t>
+        <w:t>Abb. 6 (LF5): Berichtsseite LF5 – links die Zusammensetzung der Schülerschaft nach Schulart (Input, DE 2023), rechts welche Schulart die Abgänge ohne Hauptschulabschluss stellt (Antwort, Destatis 21111-12; rechtes Diagramm je Bundesland filterbar, linkes bleibt bundesweit).</w:t>
       </w:r>
     </w:p>
     <w:p>
@@ -3277,7 +3277,7 @@
         <w:rPr>
           <w:sz w:val="22"/>
         </w:rPr>
-        <w:t>Erst die Kreuzung von Schulart und Abschlussart beantwortet die Leitfrage direkt: nicht die Größe einer Schulart entscheidet, sondern ihr Bildungsauftrag. Förderschulen und integrierte Gesamtschulen stellen zusammen rund zwei Drittel aller Abgänge ohne Hauptschulabschluss, während Gymnasien fast ausschließlich zur Hochschulreife führen. Die links gezeigte, gymnasiallastige Schülerstruktur ist die Input-Seite, die rechte Verteilung die tatsächliche Wirkung je Schulart.</w:t>
+        <w:t>Erst die Kreuzung von Schulart und Abschlussart beantwortet die Leitfrage direkt: nicht die Größe einer Schulart entscheidet, sondern ihr Bildungsauftrag. Förderschulen und integrierte Gesamtschulen stellen zusammen rund zwei Drittel aller Abgänge ohne Hauptschulabschluss, während Gymnasien fast ausschließlich zur Hochschulreife führen. Die links gezeigte, gymnasiallastige Schülerstruktur ist die Input-Seite, die rechte Verteilung die tatsächliche Wirkung je Schulart. Ein Bundesland-Filter wirkt bewusst nur auf das rechte Diagramm – so lässt sich die Schulart-Struktur der Abgänge ohne HSA je Land betrachten (z. B. Bayern mit deutlich stärkerer Hauptschul-Komponente), während links die bundesweite Schülerstruktur als feste Referenz bestehen bleibt (die Schülerzahlen-Quelle liegt nur für Deutschland vor).</w:t>
       </w:r>
     </w:p>
     <w:p>

</xml_diff>

<commit_message>
Runde 10: LF9 – Balkendiagramm (höchste Risiko-Kreise) + "Verfügbares Einkommen je Einwohner (Euro)"
- Neues Balkendiagramm (barChart, TopN=8 hoechste Risiko-Kreise, Farbe Risiko LF9, Achse ab 0) rechts unter der Ranking-Tabelle; Tabelle auf alle 10 Zeilen erhoeht, Balken scrollfrei
- "Euro statt €-Zeichen" + Umbenennung: Einkommens-Schieberegler-Header, Tabellenspalte und Scatter-Tooltip -> "Verfügbares Einkommen je Einwohner (Euro)" bzw. "Verf. Einkommen (Euro/EW)"
- Live geprueft: Balken zeigt Gelsenkirchen..Gera (8 Kreise, vermillion, ohne Scrollbalken); Labels korrekt
- pbi_lf9.png neu gecroppt; .pbix + bericht.pdf neu exportiert; DOCX/README/visual_spezifikation ergaenzt
- verify_all 111/111 (neuer LF9-Regressionsguard)

Co-Authored-By: Claude Fable 5 <noreply@anthropic.com>
</commit_message>
<xml_diff>
--- a/Schulabschluss_DataStory_Dokumentation.docx
+++ b/Schulabschluss_DataStory_Dokumentation.docx
@@ -3674,7 +3674,7 @@
       <w:r>
         <w:drawing>
           <wp:inline xmlns:a="http://schemas.openxmlformats.org/drawingml/2006/main" xmlns:pic="http://schemas.openxmlformats.org/drawingml/2006/picture">
-            <wp:extent cx="5760720" cy="3298972"/>
+            <wp:extent cx="5760720" cy="3184788"/>
             <wp:docPr id="10" name="Picture 10"/>
             <wp:cNvGraphicFramePr>
               <a:graphicFrameLocks noChangeAspect="1"/>
@@ -3695,7 +3695,7 @@
                   <pic:spPr>
                     <a:xfrm>
                       <a:off x="0" y="0"/>
-                      <a:ext cx="5760720" cy="3298972"/>
+                      <a:ext cx="5760720" cy="3184788"/>
                     </a:xfrm>
                     <a:prstGeom prst="rect"/>
                   </pic:spPr>
@@ -3716,7 +3716,7 @@
           <w:color w:val="666666"/>
           <w:sz w:val="18"/>
         </w:rPr>
-        <w:t>Abb. 10 (LF9): Berichtsseite LF9 – Bildungsrisiko × Jugendarbeitslosigkeit je Kreis und dreidimensionales Risiko-Score-Ranking (inkl. Einkommen); Spitze: Gelsenkirchen (rund 8,1). Interaktiv filterbar über einen Bundesland-Slicer und einen Einkommens-Schieberegler.</w:t>
+        <w:t>Abb. 10 (LF9): Berichtsseite LF9 – Bildungsrisiko × Jugendarbeitslosigkeit je Kreis und dreidimensionales Risiko-Score-Ranking (inkl. verfügbarem Einkommen je Einwohner); Spitze: Gelsenkirchen (rund 8,1). Punktdiagramm (Verteilung), Ranking-Tabelle und ein Balkendiagramm der höchsten Risiko-Kreise; interaktiv filterbar über einen Bundesland-Slicer und einen Schieberegler für das verfügbare Einkommen.</w:t>
       </w:r>
     </w:p>
     <w:p>
@@ -3731,7 +3731,7 @@
         <w:rPr>
           <w:sz w:val="22"/>
         </w:rPr>
-        <w:t>Die drei Merkmale ballen sich in denselben Kreisen: strukturschwache Städte und Kreise im Ruhrgebiet, in Rheinland-Pfalz, Sachsen-Anhalt und an der Unterweser. Niedriges Einkommen korreliert erwartungsgemäß mit hohem Bildungsrisiko (r = −0,49) und hoher Jugendarbeitslosigkeit (r = −0,59); die Merkmale zeigen also in dieselbe Richtung. Mit der Einkommensdimension rückt Gelsenkirchen (verfügbares Einkommen nur rund 17.900 € je Einwohner) an die Spitze, und Bremerhaven kommt neu in die Spitzengruppe. Diese Kreise sind konkrete Kandidaten für gezielte Förderung.</w:t>
+        <w:t>Die drei Merkmale ballen sich in denselben Kreisen: strukturschwache Städte und Kreise im Ruhrgebiet, in Rheinland-Pfalz, Sachsen-Anhalt und an der Unterweser. Niedriges Einkommen korreliert erwartungsgemäß mit hohem Bildungsrisiko (r = −0,49) und hoher Jugendarbeitslosigkeit (r = −0,59); die Merkmale zeigen also in dieselbe Richtung. Mit der Einkommensdimension rückt Gelsenkirchen (verfügbares Einkommen nur rund 17.900 Euro je Einwohner) an die Spitze, und Bremerhaven kommt neu in die Spitzengruppe. Diese Kreise sind konkrete Kandidaten für gezielte Förderung.</w:t>
       </w:r>
     </w:p>
     <w:p>

</xml_diff>